<commit_message>
First version working to get data from JSON and generate docx
</commit_message>
<xml_diff>
--- a/EMPTY.docx
+++ b/EMPTY.docx
@@ -241,7 +241,7 @@
           <w:szCs w:val="22"/>
         </w:rPr>
         <w:pict w14:anchorId="120C4CC9">
-          <v:rect id="_x0000_i1039" style="width:0;height:1.5pt" o:hralign="center" o:hrstd="t" o:hr="t" fillcolor="#a0a0a0" stroked="f"/>
+          <v:rect id="_x0000_i1029" style="width:0;height:1.5pt" o:hralign="center" o:hrstd="t" o:hr="t" fillcolor="#a0a0a0" stroked="f"/>
         </w:pict>
       </w:r>
     </w:p>
@@ -305,6 +305,8 @@
         <w:spacing w:after="0" w:line="240" w:lineRule="auto"/>
         <w:rPr>
           <w:rFonts w:ascii="Roboto" w:hAnsi="Roboto"/>
+          <w:b/>
+          <w:bCs/>
         </w:rPr>
       </w:pPr>
       <w:r>
@@ -331,6 +333,150 @@
         </w:rPr>
         <w:t>_TITLE_ITEM}}</w:t>
       </w:r>
+      <w:r>
+        <w:rPr>
+          <w:rFonts w:ascii="Roboto" w:hAnsi="Roboto"/>
+          <w:b/>
+          <w:bCs/>
+        </w:rPr>
+        <w:t xml:space="preserve"> | </w:t>
+      </w:r>
+      <w:r>
+        <w:rPr>
+          <w:rFonts w:ascii="Roboto" w:hAnsi="Roboto"/>
+          <w:b/>
+          <w:bCs/>
+        </w:rPr>
+        <w:t>{{</w:t>
+      </w:r>
+      <w:r>
+        <w:rPr>
+          <w:rFonts w:ascii="Roboto" w:hAnsi="Roboto"/>
+          <w:b/>
+          <w:bCs/>
+        </w:rPr>
+        <w:t>EXPERIENCE</w:t>
+      </w:r>
+      <w:r>
+        <w:rPr>
+          <w:rFonts w:ascii="Roboto" w:hAnsi="Roboto"/>
+          <w:b/>
+          <w:bCs/>
+        </w:rPr>
+        <w:t>_</w:t>
+      </w:r>
+      <w:r>
+        <w:rPr>
+          <w:rFonts w:ascii="Roboto" w:hAnsi="Roboto"/>
+          <w:b/>
+          <w:bCs/>
+        </w:rPr>
+        <w:t>COMPANY</w:t>
+      </w:r>
+      <w:r>
+        <w:rPr>
+          <w:rFonts w:ascii="Roboto" w:hAnsi="Roboto"/>
+          <w:b/>
+          <w:bCs/>
+        </w:rPr>
+        <w:t>_ITEM}}</w:t>
+      </w:r>
+      <w:r>
+        <w:rPr>
+          <w:rFonts w:ascii="Roboto" w:hAnsi="Roboto"/>
+          <w:b/>
+          <w:bCs/>
+        </w:rPr>
+        <w:t xml:space="preserve"> | </w:t>
+      </w:r>
+      <w:r>
+        <w:rPr>
+          <w:rFonts w:ascii="Roboto" w:hAnsi="Roboto"/>
+          <w:b/>
+          <w:bCs/>
+        </w:rPr>
+        <w:t>{{</w:t>
+      </w:r>
+      <w:r>
+        <w:rPr>
+          <w:rFonts w:ascii="Roboto" w:hAnsi="Roboto"/>
+          <w:b/>
+          <w:bCs/>
+        </w:rPr>
+        <w:t>EXPERIENCE</w:t>
+      </w:r>
+      <w:r>
+        <w:rPr>
+          <w:rFonts w:ascii="Roboto" w:hAnsi="Roboto"/>
+          <w:b/>
+          <w:bCs/>
+        </w:rPr>
+        <w:t>_</w:t>
+      </w:r>
+      <w:r>
+        <w:rPr>
+          <w:rFonts w:ascii="Roboto" w:hAnsi="Roboto"/>
+          <w:b/>
+          <w:bCs/>
+        </w:rPr>
+        <w:t>LOCATION</w:t>
+      </w:r>
+      <w:r>
+        <w:rPr>
+          <w:rFonts w:ascii="Roboto" w:hAnsi="Roboto"/>
+          <w:b/>
+          <w:bCs/>
+        </w:rPr>
+        <w:t>_ITEM}}</w:t>
+      </w:r>
+      <w:r>
+        <w:rPr>
+          <w:rFonts w:ascii="Roboto" w:hAnsi="Roboto"/>
+          <w:b/>
+          <w:bCs/>
+        </w:rPr>
+        <w:t xml:space="preserve"> | </w:t>
+      </w:r>
+      <w:r>
+        <w:rPr>
+          <w:rFonts w:ascii="Roboto" w:hAnsi="Roboto"/>
+          <w:b/>
+          <w:bCs/>
+        </w:rPr>
+        <w:t>{{</w:t>
+      </w:r>
+      <w:r>
+        <w:rPr>
+          <w:rFonts w:ascii="Roboto" w:hAnsi="Roboto"/>
+          <w:b/>
+          <w:bCs/>
+        </w:rPr>
+        <w:t>EXPERIENCE</w:t>
+      </w:r>
+      <w:r>
+        <w:rPr>
+          <w:rFonts w:ascii="Roboto" w:hAnsi="Roboto"/>
+          <w:b/>
+          <w:bCs/>
+        </w:rPr>
+        <w:t>_</w:t>
+      </w:r>
+      <w:r>
+        <w:rPr>
+          <w:rFonts w:ascii="Roboto" w:hAnsi="Roboto"/>
+          <w:b/>
+          <w:bCs/>
+        </w:rPr>
+        <w:t>TIME</w:t>
+      </w:r>
+      <w:r>
+        <w:rPr>
+          <w:rFonts w:ascii="Roboto" w:hAnsi="Roboto"/>
+          <w:b/>
+          <w:bCs/>
+        </w:rPr>
+        <w:t>_ITEM}}</w:t>
+      </w:r>
     </w:p>
     <w:p>
       <w:pPr>
@@ -353,23 +499,7 @@
           <w:sz w:val="22"/>
           <w:szCs w:val="22"/>
         </w:rPr>
-        <w:t>{{EXP</w:t>
-      </w:r>
-      <w:r>
-        <w:rPr>
-          <w:rFonts w:ascii="Roboto" w:hAnsi="Roboto"/>
-          <w:sz w:val="22"/>
-          <w:szCs w:val="22"/>
-        </w:rPr>
-        <w:t xml:space="preserve"> </w:t>
-      </w:r>
-      <w:r>
-        <w:rPr>
-          <w:rFonts w:ascii="Roboto" w:hAnsi="Roboto"/>
-          <w:sz w:val="22"/>
-          <w:szCs w:val="22"/>
-        </w:rPr>
-        <w:t>_ITEM}}</w:t>
+        <w:t>{{EXP _ITEM}}</w:t>
       </w:r>
     </w:p>
     <w:p>
@@ -438,15 +568,7 @@
           <w:sz w:val="22"/>
           <w:szCs w:val="22"/>
         </w:rPr>
-        <w:t>EXP_PROJECT</w:t>
-      </w:r>
-      <w:r>
-        <w:rPr>
-          <w:rFonts w:ascii="Roboto" w:hAnsi="Roboto"/>
-          <w:sz w:val="22"/>
-          <w:szCs w:val="22"/>
-        </w:rPr>
-        <w:t>_ITEM}}</w:t>
+        <w:t>EXP_PROJECT_ITEM}}</w:t>
       </w:r>
     </w:p>
     <w:p>
@@ -465,7 +587,7 @@
           <w:szCs w:val="22"/>
         </w:rPr>
         <w:pict w14:anchorId="7CEA766F">
-          <v:rect id="_x0000_i1040" style="width:0;height:1.5pt" o:hralign="center" o:hrstd="t" o:hr="t" fillcolor="#a0a0a0" stroked="f"/>
+          <v:rect id="_x0000_i1030" style="width:0;height:1.5pt" o:hralign="center" o:hrstd="t" o:hr="t" fillcolor="#a0a0a0" stroked="f"/>
         </w:pict>
       </w:r>
     </w:p>
@@ -542,7 +664,7 @@
           <w:rFonts w:ascii="Roboto" w:hAnsi="Roboto"/>
         </w:rPr>
         <w:pict w14:anchorId="49CE821A">
-          <v:rect id="_x0000_i1041" style="width:0;height:1.5pt" o:hralign="center" o:hrstd="t" o:hr="t" fillcolor="#a0a0a0" stroked="f"/>
+          <v:rect id="_x0000_i1031" style="width:0;height:1.5pt" o:hralign="center" o:hrstd="t" o:hr="t" fillcolor="#a0a0a0" stroked="f"/>
         </w:pict>
       </w:r>
     </w:p>
@@ -618,7 +740,7 @@
           <w:szCs w:val="22"/>
         </w:rPr>
         <w:pict w14:anchorId="1261EA01">
-          <v:rect id="_x0000_i1042" style="width:0;height:1.5pt" o:hralign="center" o:hrstd="t" o:hr="t" fillcolor="#a0a0a0" stroked="f"/>
+          <v:rect id="_x0000_i1032" style="width:0;height:1.5pt" o:hralign="center" o:hrstd="t" o:hr="t" fillcolor="#a0a0a0" stroked="f"/>
         </w:pict>
       </w:r>
     </w:p>
@@ -894,23 +1016,7 @@
           <w:sz w:val="22"/>
           <w:szCs w:val="22"/>
         </w:rPr>
-        <w:t>{{</w:t>
-      </w:r>
-      <w:r>
-        <w:rPr>
-          <w:rFonts w:ascii="Roboto" w:hAnsi="Roboto"/>
-          <w:sz w:val="22"/>
-          <w:szCs w:val="22"/>
-        </w:rPr>
-        <w:t>THESIS</w:t>
-      </w:r>
-      <w:r>
-        <w:rPr>
-          <w:rFonts w:ascii="Roboto" w:hAnsi="Roboto"/>
-          <w:sz w:val="22"/>
-          <w:szCs w:val="22"/>
-        </w:rPr>
-        <w:t>_REPLACE}}</w:t>
+        <w:t>{{THESIS_REPLACE}}</w:t>
       </w:r>
     </w:p>
     <w:p>

</xml_diff>